<commit_message>
Added the bit bucket checkin in CheckinReport
Former-commit-id: a889779be341a1b826ac21d18c4da6dfca41b7cb
</commit_message>
<xml_diff>
--- a/Checkins/CheckinReport v0.4.1_formatter_Phase2.docx
+++ b/Checkins/CheckinReport v0.4.1_formatter_Phase2.docx
@@ -15,34 +15,66 @@
       <w:r>
         <w:t>, 2018</w:t>
       </w:r>
+    </w:p>
+    <w:p/>
+    <w:p>
+      <w:r>
+        <w:t xml:space="preserve">DEVELOPER: </w:t>
+      </w:r>
+      <w:r>
+        <w:t>Alka &amp; Ray</w:t>
+      </w:r>
+    </w:p>
+    <w:p/>
+    <w:p>
+      <w:r>
+        <w:t>PRODUCT:</w:t>
+      </w:r>
+      <w:r>
+        <w:t xml:space="preserve"> SE</w:t>
+      </w:r>
+    </w:p>
+    <w:p/>
+    <w:p>
+      <w:pPr>
+        <w:rPr>
+          <w:b/>
+        </w:rPr>
+      </w:pPr>
+      <w:r>
+        <w:rPr>
+          <w:b/>
+        </w:rPr>
+        <w:t xml:space="preserve">BRANCH: </w:t>
+      </w:r>
+      <w:r>
+        <w:rPr>
+          <w:b/>
+        </w:rPr>
+        <w:t>m</w:t>
+      </w:r>
+      <w:r>
+        <w:rPr>
+          <w:b/>
+        </w:rPr>
+        <w:t>aster_SE0.4</w:t>
+      </w:r>
+    </w:p>
+    <w:p>
+      <w:pPr>
+        <w:rPr>
+          <w:b/>
+        </w:rPr>
+      </w:pPr>
       <w:bookmarkStart w:id="0" w:name="_GoBack"/>
       <w:bookmarkEnd w:id="0"/>
     </w:p>
-    <w:p/>
     <w:p>
       <w:r>
-        <w:t xml:space="preserve">DEVELOPER: </w:t>
-      </w:r>
-      <w:r>
-        <w:t>Alka &amp; Ray</w:t>
-      </w:r>
-    </w:p>
-    <w:p/>
-    <w:p>
-      <w:r>
-        <w:t>PRODUCT:</w:t>
-      </w:r>
-      <w:r>
-        <w:t xml:space="preserve"> SE</w:t>
-      </w:r>
-    </w:p>
-    <w:p/>
-    <w:p>
-      <w:r>
         <w:t xml:space="preserve">CHECK-IN/HASH (from bitbucket.org) </w:t>
       </w:r>
       <w:r>
-        <w:t>------------</w:t>
+        <w:t>66361ea535</w:t>
       </w:r>
     </w:p>
     <w:p/>
@@ -130,15 +162,7 @@
           </w:tcPr>
           <w:p>
             <w:r>
-              <w:t xml:space="preserve">Terminator as </w:t>
-            </w:r>
-            <w:proofErr w:type="gramStart"/>
-            <w:r>
-              <w:t>per  the</w:t>
-            </w:r>
-            <w:proofErr w:type="gramEnd"/>
-            <w:r>
-              <w:t xml:space="preserve"> formatter phase 2 documentation</w:t>
+              <w:t>Terminator as per  the formatter phase 2 documentation</w:t>
             </w:r>
           </w:p>
         </w:tc>
@@ -160,15 +184,7 @@
           </w:tcPr>
           <w:p>
             <w:r>
-              <w:t xml:space="preserve">SE not handling </w:t>
-            </w:r>
-            <w:proofErr w:type="spellStart"/>
-            <w:r>
-              <w:t>enclosed_by</w:t>
-            </w:r>
-            <w:proofErr w:type="spellEnd"/>
-            <w:r>
-              <w:t xml:space="preserve"> for non-text fields</w:t>
+              <w:t>SE not handling enclosed_by for non-text fields</w:t>
             </w:r>
           </w:p>
         </w:tc>
@@ -177,13 +193,8 @@
             <w:tcW w:w="4110" w:type="dxa"/>
           </w:tcPr>
           <w:p>
-            <w:proofErr w:type="spellStart"/>
-            <w:r>
-              <w:t>Enclosed_by</w:t>
-            </w:r>
-            <w:proofErr w:type="spellEnd"/>
-            <w:r>
-              <w:t xml:space="preserve"> as per the formatter phase 2 documentation</w:t>
+            <w:r>
+              <w:t>Enclosed_by as per the formatter phase 2 documentation</w:t>
             </w:r>
           </w:p>
         </w:tc>
@@ -215,15 +226,7 @@
           </w:tcPr>
           <w:p>
             <w:r>
-              <w:t xml:space="preserve">Terminator as </w:t>
-            </w:r>
-            <w:proofErr w:type="gramStart"/>
-            <w:r>
-              <w:t>per  the</w:t>
-            </w:r>
-            <w:proofErr w:type="gramEnd"/>
-            <w:r>
-              <w:t xml:space="preserve"> formatter phase 2 documentation</w:t>
+              <w:t>Terminator as per  the formatter phase 2 documentation</w:t>
             </w:r>
           </w:p>
         </w:tc>
@@ -255,15 +258,7 @@
           </w:tcPr>
           <w:p>
             <w:r>
-              <w:t xml:space="preserve">Terminator as </w:t>
-            </w:r>
-            <w:proofErr w:type="gramStart"/>
-            <w:r>
-              <w:t>per  the</w:t>
-            </w:r>
-            <w:proofErr w:type="gramEnd"/>
-            <w:r>
-              <w:t xml:space="preserve"> formatter phase 2 documentation</w:t>
+              <w:t>Terminator as per  the formatter phase 2 documentation</w:t>
             </w:r>
           </w:p>
         </w:tc>
@@ -294,13 +289,8 @@
             <w:tcW w:w="4110" w:type="dxa"/>
           </w:tcPr>
           <w:p>
-            <w:proofErr w:type="spellStart"/>
-            <w:r>
-              <w:t>Enclosed_by</w:t>
-            </w:r>
-            <w:proofErr w:type="spellEnd"/>
-            <w:r>
-              <w:t xml:space="preserve"> as per the formatter phase 2 documentation</w:t>
+            <w:r>
+              <w:t>Enclosed_by as per the formatter phase 2 documentation</w:t>
             </w:r>
           </w:p>
         </w:tc>

</xml_diff>